<commit_message>
Variante B: neue Bildserie im Stil der früheren Bilder (Higgsfield), Deck B mit neuen Bildfolien
Co-Authored-By: Claude Sonnet 5.5 <noreply@anthropic.com>
Claude-Session: https://claude.ai/code/session_01HJGZfxHv7bzYyqdLwg8aFJ
</commit_message>
<xml_diff>
--- a/praesentation/werlte_master/businessplan/Businessplan_B.docx
+++ b/praesentation/werlte_master/businessplan/Businessplan_B.docx
@@ -31,7 +31,7 @@
       <w:r>
         <w:drawing>
           <wp:inline xmlns:a="http://schemas.openxmlformats.org/drawingml/2006/main" xmlns:pic="http://schemas.openxmlformats.org/drawingml/2006/picture">
-            <wp:extent cx="5580000" cy="3114655"/>
+            <wp:extent cx="5580000" cy="3115500"/>
             <wp:docPr id="1" name="Picture 1"/>
             <wp:cNvGraphicFramePr>
               <a:graphicFrameLocks noChangeAspect="1"/>
@@ -40,7 +40,7 @@
               <a:graphicData uri="http://schemas.openxmlformats.org/drawingml/2006/picture">
                 <pic:pic>
                   <pic:nvPicPr>
-                    <pic:cNvPr id="0" name="hf_F2_persp.jpg"/>
+                    <pic:cNvPr id="0" name="B2_hero.jpg"/>
                     <pic:cNvPicPr/>
                   </pic:nvPicPr>
                   <pic:blipFill>
@@ -52,7 +52,7 @@
                   <pic:spPr>
                     <a:xfrm>
                       <a:off x="0" y="0"/>
-                      <a:ext cx="5580000" cy="3114655"/>
+                      <a:ext cx="5580000" cy="3115500"/>
                     </a:xfrm>
                     <a:prstGeom prst="rect"/>
                   </pic:spPr>
@@ -4338,7 +4338,7 @@
         <w:rPr>
           <w:b w:val="0"/>
         </w:rPr>
-        <w:t>Ergebnis pro Monat nach Kapitaldienst (Plan) und Stresstests: siehe Präsentation, Folie 23. Ohne Gastro fällt das Ergebnis auf −9.408 € / −9.520 € / −9.802 € pro Monat.</w:t>
+        <w:t>Ergebnis pro Monat nach Kapitaldienst (Plan) und Stresstests: siehe Präsentation, Folie 'Prognose und Belastungstest'. Ohne Gastro fällt das Ergebnis auf −9.408 € / −9.520 € / −9.802 € pro Monat.</w:t>
       </w:r>
     </w:p>
     <w:p>

</xml_diff>

<commit_message>
Variante R: EG 540 m², Vorbau ringsum (R1–R3); Businessplan B, Revitalyze-PDFs und Bildserie darauf umgestellt
Co-Authored-By: Claude Sonnet 5.5 <noreply@anthropic.com>
Claude-Session: https://claude.ai/code/session_01HJGZfxHv7bzYyqdLwg8aFJ
</commit_message>
<xml_diff>
--- a/praesentation/werlte_master/businessplan/Businessplan_B.docx
+++ b/praesentation/werlte_master/businessplan/Businessplan_B.docx
@@ -40,7 +40,7 @@
               <a:graphicData uri="http://schemas.openxmlformats.org/drawingml/2006/picture">
                 <pic:pic>
                   <pic:nvPicPr>
-                    <pic:cNvPr id="0" name="B2_hero.jpg"/>
+                    <pic:cNvPr id="0" name="R2_hero.jpg"/>
                     <pic:cNvPicPr/>
                   </pic:nvPicPr>
                   <pic:blipFill>
@@ -95,7 +95,7 @@
         <w:rPr>
           <w:b w:val="0"/>
         </w:rPr>
-        <w:t>schmales EG (18 × 30 m), 1. und 2. OG breiter über Säulen, Stellplätze unter dem Vorbau.</w:t>
+        <w:t>schmales EG (20 × 27 m = 540 m², GRZ-Grenze), 1. und 2. OG ringsum auskragend auf Säulen, Stellplätze unter dem Vorbau.</w:t>
       </w:r>
     </w:p>
     <w:tbl>
@@ -202,7 +202,7 @@
                 <w:b w:val="0"/>
                 <w:sz w:val="17"/>
               </w:rPr>
-              <w:t>5.724.949 €</w:t>
+              <w:t>5.846.915 €</w:t>
             </w:r>
           </w:p>
         </w:tc>
@@ -220,7 +220,7 @@
                 <w:b w:val="0"/>
                 <w:sz w:val="17"/>
               </w:rPr>
-              <w:t>5.455.050 €</w:t>
+              <w:t>5.574.447 €</w:t>
             </w:r>
           </w:p>
         </w:tc>
@@ -238,7 +238,7 @@
                 <w:b w:val="0"/>
                 <w:sz w:val="17"/>
               </w:rPr>
-              <w:t>5.219.586 €</w:t>
+              <w:t>5.339.997 €</w:t>
             </w:r>
           </w:p>
         </w:tc>
@@ -273,7 +273,7 @@
                 <w:b w:val="0"/>
                 <w:sz w:val="17"/>
               </w:rPr>
-              <w:t>2.834.910 € / 2.890.039 €</w:t>
+              <w:t>2.828.110 € / 3.018.805 €</w:t>
             </w:r>
           </w:p>
         </w:tc>
@@ -291,7 +291,7 @@
                 <w:b w:val="0"/>
                 <w:sz w:val="17"/>
               </w:rPr>
-              <w:t>2.834.910 € / 2.620.140 €</w:t>
+              <w:t>2.828.110 € / 2.746.337 €</w:t>
             </w:r>
           </w:p>
         </w:tc>
@@ -309,7 +309,7 @@
                 <w:b w:val="0"/>
                 <w:sz w:val="17"/>
               </w:rPr>
-              <w:t>2.684.910 € / 2.534.676 €</w:t>
+              <w:t>2.528.110 € / 2.811.887 €</w:t>
             </w:r>
           </w:p>
         </w:tc>
@@ -344,7 +344,7 @@
                 <w:b w:val="0"/>
                 <w:sz w:val="17"/>
               </w:rPr>
-              <w:t>20.617 €</w:t>
+              <w:t>21.130 €</w:t>
             </w:r>
           </w:p>
         </w:tc>
@@ -362,7 +362,7 @@
                 <w:b w:val="0"/>
                 <w:sz w:val="17"/>
               </w:rPr>
-              <w:t>19.492 €</w:t>
+              <w:t>19.995 €</w:t>
             </w:r>
           </w:p>
         </w:tc>
@@ -380,7 +380,7 @@
                 <w:b w:val="0"/>
                 <w:sz w:val="17"/>
               </w:rPr>
-              <w:t>18.698 €</w:t>
+              <w:t>19.393 €</w:t>
             </w:r>
           </w:p>
         </w:tc>
@@ -415,7 +415,7 @@
                 <w:b w:val="0"/>
                 <w:sz w:val="17"/>
               </w:rPr>
-              <w:t>+547 €</w:t>
+              <w:t>+373 €</w:t>
             </w:r>
           </w:p>
         </w:tc>
@@ -433,7 +433,7 @@
                 <w:b w:val="0"/>
                 <w:sz w:val="17"/>
               </w:rPr>
-              <w:t>+436 €</w:t>
+              <w:t>+260 €</w:t>
             </w:r>
           </w:p>
         </w:tc>
@@ -451,7 +451,7 @@
                 <w:b w:val="0"/>
                 <w:sz w:val="17"/>
               </w:rPr>
-              <w:t>+154 €</w:t>
+              <w:t>−227 €</w:t>
             </w:r>
           </w:p>
         </w:tc>
@@ -486,7 +486,7 @@
                 <w:b w:val="0"/>
                 <w:sz w:val="17"/>
               </w:rPr>
-              <w:t>1,03 / 0,71</w:t>
+              <w:t>1,02 / 0,70</w:t>
             </w:r>
           </w:p>
         </w:tc>
@@ -504,7 +504,7 @@
                 <w:b w:val="0"/>
                 <w:sz w:val="17"/>
               </w:rPr>
-              <w:t>1,02 / 0,69</w:t>
+              <w:t>1,01 / 0,68</w:t>
             </w:r>
           </w:p>
         </w:tc>
@@ -522,7 +522,7 @@
                 <w:b w:val="0"/>
                 <w:sz w:val="17"/>
               </w:rPr>
-              <w:t>1,01 / 0,66</w:t>
+              <w:t>0,99 / 0,65</w:t>
             </w:r>
           </w:p>
         </w:tc>
@@ -557,7 +557,7 @@
                 <w:b w:val="0"/>
                 <w:sz w:val="17"/>
               </w:rPr>
-              <w:t>3,59 Mio. € / 177 %</w:t>
+              <w:t>3,67 Mio. € / 177 %</w:t>
             </w:r>
           </w:p>
         </w:tc>
@@ -575,7 +575,7 @@
                 <w:b w:val="0"/>
                 <w:sz w:val="17"/>
               </w:rPr>
-              <w:t>3,25 Mio. € / 186 %</w:t>
+              <w:t>3,34 Mio. € / 186 %</w:t>
             </w:r>
           </w:p>
         </w:tc>
@@ -593,7 +593,7 @@
                 <w:b w:val="0"/>
                 <w:sz w:val="17"/>
               </w:rPr>
-              <w:t>2,97 Mio. € / 196 %</w:t>
+              <w:t>3,04 Mio. € / 195 %</w:t>
             </w:r>
           </w:p>
         </w:tc>
@@ -805,7 +805,7 @@
                 <w:b w:val="0"/>
                 <w:sz w:val="17"/>
               </w:rPr>
-              <w:t>756 m²</w:t>
+              <w:t>780 m²</w:t>
             </w:r>
           </w:p>
         </w:tc>
@@ -823,7 +823,7 @@
                 <w:b w:val="0"/>
                 <w:sz w:val="17"/>
               </w:rPr>
-              <w:t>756 m²</w:t>
+              <w:t>780 m²</w:t>
             </w:r>
           </w:p>
         </w:tc>
@@ -841,7 +841,7 @@
                 <w:b w:val="0"/>
                 <w:sz w:val="17"/>
               </w:rPr>
-              <w:t>756 m²</w:t>
+              <w:t>780 m²</w:t>
             </w:r>
           </w:p>
         </w:tc>
@@ -876,7 +876,7 @@
                 <w:b w:val="0"/>
                 <w:sz w:val="17"/>
               </w:rPr>
-              <w:t>756 m²</w:t>
+              <w:t>780 m²</w:t>
             </w:r>
           </w:p>
         </w:tc>
@@ -894,7 +894,7 @@
                 <w:b w:val="0"/>
                 <w:sz w:val="17"/>
               </w:rPr>
-              <w:t>598 m²</w:t>
+              <w:t>621 m²</w:t>
             </w:r>
           </w:p>
         </w:tc>
@@ -912,7 +912,7 @@
                 <w:b w:val="0"/>
                 <w:sz w:val="17"/>
               </w:rPr>
-              <w:t>459 m²</w:t>
+              <w:t>480 m²</w:t>
             </w:r>
           </w:p>
         </w:tc>
@@ -947,7 +947,7 @@
                 <w:b/>
                 <w:sz w:val="17"/>
               </w:rPr>
-              <w:t>2.052 m²</w:t>
+              <w:t>2.100 m²</w:t>
             </w:r>
           </w:p>
         </w:tc>
@@ -965,7 +965,7 @@
                 <w:b/>
                 <w:sz w:val="17"/>
               </w:rPr>
-              <w:t>1.894 m²</w:t>
+              <w:t>1.941 m²</w:t>
             </w:r>
           </w:p>
         </w:tc>
@@ -983,7 +983,7 @@
                 <w:b/>
                 <w:sz w:val="17"/>
               </w:rPr>
-              <w:t>1.755 m²</w:t>
+              <w:t>1.800 m²</w:t>
             </w:r>
           </w:p>
         </w:tc>
@@ -1018,7 +1018,7 @@
                 <w:b w:val="0"/>
                 <w:sz w:val="17"/>
               </w:rPr>
-              <w:t>1.065 m² / 14</w:t>
+              <w:t>1.098 m² / 14</w:t>
             </w:r>
           </w:p>
         </w:tc>
@@ -1036,7 +1036,7 @@
                 <w:b w:val="0"/>
                 <w:sz w:val="17"/>
               </w:rPr>
-              <w:t>942 m² / 14</w:t>
+              <w:t>974 m² / 14</w:t>
             </w:r>
           </w:p>
         </w:tc>
@@ -1054,7 +1054,7 @@
                 <w:b w:val="0"/>
                 <w:sz w:val="17"/>
               </w:rPr>
-              <w:t>835 m² / 13</w:t>
+              <w:t>866 m² / 12</w:t>
             </w:r>
           </w:p>
         </w:tc>
@@ -1291,7 +1291,7 @@
                 <w:b w:val="0"/>
                 <w:sz w:val="17"/>
               </w:rPr>
-              <w:t>376 m²</w:t>
+              <w:t>372 m²</w:t>
             </w:r>
           </w:p>
         </w:tc>
@@ -1309,7 +1309,7 @@
                 <w:b w:val="0"/>
                 <w:sz w:val="17"/>
               </w:rPr>
-              <w:t>376 m²</w:t>
+              <w:t>372 m²</w:t>
             </w:r>
           </w:p>
         </w:tc>
@@ -1327,7 +1327,7 @@
                 <w:b w:val="0"/>
                 <w:sz w:val="17"/>
               </w:rPr>
-              <w:t>376 m²</w:t>
+              <w:t>372 m²</w:t>
             </w:r>
           </w:p>
         </w:tc>
@@ -1610,7 +1610,7 @@
                 <w:b w:val="0"/>
                 <w:sz w:val="17"/>
               </w:rPr>
-              <w:t>4.514.400 €</w:t>
+              <w:t>4.620.000 €</w:t>
             </w:r>
           </w:p>
         </w:tc>
@@ -1628,7 +1628,7 @@
                 <w:b w:val="0"/>
                 <w:sz w:val="17"/>
               </w:rPr>
-              <w:t>4.167.900 €</w:t>
+              <w:t>4.270.200 €</w:t>
             </w:r>
           </w:p>
         </w:tc>
@@ -1646,7 +1646,7 @@
                 <w:b w:val="0"/>
                 <w:sz w:val="17"/>
               </w:rPr>
-              <w:t>3.861.000 €</w:t>
+              <w:t>3.960.000 €</w:t>
             </w:r>
           </w:p>
         </w:tc>
@@ -1681,7 +1681,7 @@
                 <w:b w:val="0"/>
                 <w:sz w:val="17"/>
               </w:rPr>
-              <w:t>−302.400 €</w:t>
+              <w:t>−312.000 €</w:t>
             </w:r>
           </w:p>
         </w:tc>
@@ -1699,7 +1699,7 @@
                 <w:b w:val="0"/>
                 <w:sz w:val="17"/>
               </w:rPr>
-              <w:t>−239.400 €</w:t>
+              <w:t>−248.400 €</w:t>
             </w:r>
           </w:p>
         </w:tc>
@@ -1717,7 +1717,7 @@
                 <w:b w:val="0"/>
                 <w:sz w:val="17"/>
               </w:rPr>
-              <w:t>−183.600 €</w:t>
+              <w:t>−192.000 €</w:t>
             </w:r>
           </w:p>
         </w:tc>
@@ -1770,7 +1770,7 @@
                 <w:b w:val="0"/>
                 <w:sz w:val="17"/>
               </w:rPr>
-              <w:t>70.875 €</w:t>
+              <w:t>71.550 €</w:t>
             </w:r>
           </w:p>
         </w:tc>
@@ -1788,7 +1788,7 @@
                 <w:b w:val="0"/>
                 <w:sz w:val="17"/>
               </w:rPr>
-              <w:t>133.650 €</w:t>
+              <w:t>135.000 €</w:t>
             </w:r>
           </w:p>
         </w:tc>
@@ -1823,7 +1823,7 @@
                 <w:b w:val="0"/>
                 <w:sz w:val="17"/>
               </w:rPr>
-              <w:t>631.800 €</w:t>
+              <w:t>646.200 €</w:t>
             </w:r>
           </w:p>
         </w:tc>
@@ -1841,7 +1841,7 @@
                 <w:b w:val="0"/>
                 <w:sz w:val="17"/>
               </w:rPr>
-              <w:t>599.906 €</w:t>
+              <w:t>614.002 €</w:t>
             </w:r>
           </w:p>
         </w:tc>
@@ -1859,7 +1859,7 @@
                 <w:b w:val="0"/>
                 <w:sz w:val="17"/>
               </w:rPr>
-              <w:t>571.658 €</w:t>
+              <w:t>585.450 €</w:t>
             </w:r>
           </w:p>
         </w:tc>
@@ -1894,7 +1894,7 @@
                 <w:b w:val="0"/>
                 <w:sz w:val="17"/>
               </w:rPr>
-              <w:t>145.314 €</w:t>
+              <w:t>148.626 €</w:t>
             </w:r>
           </w:p>
         </w:tc>
@@ -1912,7 +1912,7 @@
                 <w:b w:val="0"/>
                 <w:sz w:val="17"/>
               </w:rPr>
-              <w:t>137.978 €</w:t>
+              <w:t>141.221 €</w:t>
             </w:r>
           </w:p>
         </w:tc>
@@ -1930,7 +1930,7 @@
                 <w:b w:val="0"/>
                 <w:sz w:val="17"/>
               </w:rPr>
-              <w:t>131.481 €</w:t>
+              <w:t>134.654 €</w:t>
             </w:r>
           </w:p>
         </w:tc>
@@ -2107,7 +2107,7 @@
                 <w:b w:val="0"/>
                 <w:sz w:val="17"/>
               </w:rPr>
-              <w:t>324.934 €</w:t>
+              <w:t>333.188 €</w:t>
             </w:r>
           </w:p>
         </w:tc>
@@ -2125,7 +2125,7 @@
                 <w:b w:val="0"/>
                 <w:sz w:val="17"/>
               </w:rPr>
-              <w:t>306.890 €</w:t>
+              <w:t>314.973 €</w:t>
             </w:r>
           </w:p>
         </w:tc>
@@ -2143,7 +2143,7 @@
                 <w:b w:val="0"/>
                 <w:sz w:val="17"/>
               </w:rPr>
-              <w:t>294.496 €</w:t>
+              <w:t>305.993 €</w:t>
             </w:r>
           </w:p>
         </w:tc>
@@ -2178,7 +2178,7 @@
                 <w:b/>
                 <w:sz w:val="17"/>
               </w:rPr>
-              <w:t>5.724.949 €</w:t>
+              <w:t>5.846.915 €</w:t>
             </w:r>
           </w:p>
         </w:tc>
@@ -2196,7 +2196,7 @@
                 <w:b/>
                 <w:sz w:val="17"/>
               </w:rPr>
-              <w:t>5.455.050 €</w:t>
+              <w:t>5.574.447 €</w:t>
             </w:r>
           </w:p>
         </w:tc>
@@ -2214,7 +2214,7 @@
                 <w:b/>
                 <w:sz w:val="17"/>
               </w:rPr>
-              <w:t>5.219.586 €</w:t>
+              <w:t>5.339.997 €</w:t>
             </w:r>
           </w:p>
         </w:tc>
@@ -2388,7 +2388,7 @@
                 <w:b w:val="0"/>
                 <w:sz w:val="17"/>
               </w:rPr>
-              <w:t>1.950.000 €</w:t>
+              <w:t>1.800.000 €</w:t>
             </w:r>
           </w:p>
         </w:tc>
@@ -2441,7 +2441,7 @@
                 <w:b w:val="0"/>
                 <w:sz w:val="17"/>
               </w:rPr>
-              <w:t>734.910 €</w:t>
+              <w:t>728.110 €</w:t>
             </w:r>
           </w:p>
         </w:tc>
@@ -2459,7 +2459,7 @@
                 <w:b w:val="0"/>
                 <w:sz w:val="17"/>
               </w:rPr>
-              <w:t>734.910 €</w:t>
+              <w:t>728.110 €</w:t>
             </w:r>
           </w:p>
         </w:tc>
@@ -2477,7 +2477,7 @@
                 <w:b w:val="0"/>
                 <w:sz w:val="17"/>
               </w:rPr>
-              <w:t>734.910 €</w:t>
+              <w:t>728.110 €</w:t>
             </w:r>
           </w:p>
         </w:tc>
@@ -2530,7 +2530,7 @@
                 <w:b w:val="0"/>
                 <w:sz w:val="17"/>
               </w:rPr>
-              <w:t>2.890.039 €</w:t>
+              <w:t>3.018.805 €</w:t>
             </w:r>
           </w:p>
         </w:tc>
@@ -2548,7 +2548,7 @@
                 <w:b w:val="0"/>
                 <w:sz w:val="17"/>
               </w:rPr>
-              <w:t>2.620.140 €</w:t>
+              <w:t>2.746.337 €</w:t>
             </w:r>
           </w:p>
         </w:tc>
@@ -2566,7 +2566,7 @@
                 <w:b w:val="0"/>
                 <w:sz w:val="17"/>
               </w:rPr>
-              <w:t>2.534.676 €</w:t>
+              <w:t>2.811.887 €</w:t>
             </w:r>
           </w:p>
         </w:tc>
@@ -2619,25 +2619,7 @@
                 <w:b w:val="0"/>
                 <w:sz w:val="17"/>
               </w:rPr>
-              <w:t>3,32 %</w:t>
-            </w:r>
-          </w:p>
-        </w:tc>
-        <w:tc>
-          <w:tcPr>
-            <w:tcW w:type="dxa" w:w="1949"/>
-          </w:tcPr>
-          <w:p>
-            <w:pPr>
-              <w:jc w:val="right"/>
-            </w:pPr>
-            <w:r/>
-            <w:r>
-              <w:rPr>
-                <w:b w:val="0"/>
-                <w:sz w:val="17"/>
-              </w:rPr>
-              <w:t>3,29 %</w:t>
+              <w:t>3,34 %</w:t>
             </w:r>
           </w:p>
         </w:tc>
@@ -2656,6 +2638,24 @@
                 <w:sz w:val="17"/>
               </w:rPr>
               <w:t>3,30 %</w:t>
+            </w:r>
+          </w:p>
+        </w:tc>
+        <w:tc>
+          <w:tcPr>
+            <w:tcW w:type="dxa" w:w="1949"/>
+          </w:tcPr>
+          <w:p>
+            <w:pPr>
+              <w:jc w:val="right"/>
+            </w:pPr>
+            <w:r/>
+            <w:r>
+              <w:rPr>
+                <w:b w:val="0"/>
+                <w:sz w:val="17"/>
+              </w:rPr>
+              <w:t>3,36 %</w:t>
             </w:r>
           </w:p>
         </w:tc>
@@ -2707,7 +2707,7 @@
                 <w:b w:val="0"/>
                 <w:sz w:val="17"/>
               </w:rPr>
-              <w:t>20.617 €</w:t>
+              <w:t>21.130 €</w:t>
             </w:r>
           </w:p>
         </w:tc>
@@ -2725,7 +2725,7 @@
                 <w:b w:val="0"/>
                 <w:sz w:val="17"/>
               </w:rPr>
-              <w:t>19.492 €</w:t>
+              <w:t>19.995 €</w:t>
             </w:r>
           </w:p>
         </w:tc>
@@ -2743,7 +2743,7 @@
                 <w:b w:val="0"/>
                 <w:sz w:val="17"/>
               </w:rPr>
-              <w:t>18.698 €</w:t>
+              <w:t>19.393 €</w:t>
             </w:r>
           </w:p>
         </w:tc>
@@ -2890,7 +2890,7 @@
                 <w:b w:val="0"/>
                 <w:sz w:val="17"/>
               </w:rPr>
-              <w:t>189.269 € / 58.129 € / 5.666.819 €</w:t>
+              <w:t>194.193 € / 59.372 € / 5.787.543 €</w:t>
             </w:r>
           </w:p>
         </w:tc>
@@ -2908,7 +2908,7 @@
                 <w:b w:val="0"/>
                 <w:sz w:val="17"/>
               </w:rPr>
-              <w:t>178.523 € / 55.380 € / 5.399.670 €</w:t>
+              <w:t>183.344 € / 56.597 € / 5.517.851 €</w:t>
             </w:r>
           </w:p>
         </w:tc>
@@ -2926,7 +2926,7 @@
                 <w:b w:val="0"/>
                 <w:sz w:val="17"/>
               </w:rPr>
-              <w:t>171.388 € / 52.993 € / 5.166.593 €</w:t>
+              <w:t>178.489 € / 54.230 € / 5.285.767 €</w:t>
             </w:r>
           </w:p>
         </w:tc>
@@ -2961,7 +2961,7 @@
                 <w:b w:val="0"/>
                 <w:sz w:val="17"/>
               </w:rPr>
-              <w:t>187.306 € / 60.093 € / 5.606.727 €</w:t>
+              <w:t>192.178 € / 61.386 € / 5.726.157 €</w:t>
             </w:r>
           </w:p>
         </w:tc>
@@ -2979,7 +2979,7 @@
                 <w:b w:val="0"/>
                 <w:sz w:val="17"/>
               </w:rPr>
-              <w:t>176.672 € / 57.232 € / 5.342.438 €</w:t>
+              <w:t>181.443 € / 58.498 € / 5.459.352 €</w:t>
             </w:r>
           </w:p>
         </w:tc>
@@ -2997,7 +2997,7 @@
                 <w:b w:val="0"/>
                 <w:sz w:val="17"/>
               </w:rPr>
-              <w:t>169.610 € / 54.770 € / 5.111.823 €</w:t>
+              <w:t>176.637 € / 56.082 € / 5.229.686 €</w:t>
             </w:r>
           </w:p>
         </w:tc>
@@ -3032,7 +3032,7 @@
                 <w:b w:val="0"/>
                 <w:sz w:val="17"/>
               </w:rPr>
-              <w:t>180.990 € / 66.408 € / 5.413.964 €</w:t>
+              <w:t>185.696 € / 67.869 € / 5.529.183 €</w:t>
             </w:r>
           </w:p>
         </w:tc>
@@ -3050,7 +3050,7 @@
                 <w:b w:val="0"/>
                 <w:sz w:val="17"/>
               </w:rPr>
-              <w:t>170.720 € / 63.183 € / 5.158.977 €</w:t>
+              <w:t>175.328 € / 64.613 € / 5.271.769 €</w:t>
             </w:r>
           </w:p>
         </w:tc>
@@ -3068,7 +3068,7 @@
                 <w:b w:val="0"/>
                 <w:sz w:val="17"/>
               </w:rPr>
-              <w:t>163.895 € / 60.485 € / 4.936.215 €</w:t>
+              <w:t>170.676 € / 62.043 € / 5.049.657 €</w:t>
             </w:r>
           </w:p>
         </w:tc>
@@ -3103,7 +3103,7 @@
                 <w:b w:val="0"/>
                 <w:sz w:val="17"/>
               </w:rPr>
-              <w:t>168.879 € / 78.520 € / 5.046.435 €</w:t>
+              <w:t>173.256 € / 80.308 € / 5.153.393 €</w:t>
             </w:r>
           </w:p>
         </w:tc>
@@ -3121,7 +3121,7 @@
                 <w:b w:val="0"/>
                 <w:sz w:val="17"/>
               </w:rPr>
-              <w:t>159.322 € / 74.582 € / 4.809.656 €</w:t>
+              <w:t>163.608 € / 76.333 € / 4.914.359 €</w:t>
             </w:r>
           </w:p>
         </w:tc>
@@ -3139,7 +3139,7 @@
                 <w:b w:val="0"/>
                 <w:sz w:val="17"/>
               </w:rPr>
-              <w:t>152.945 € / 71.435 € / 4.601.700 €</w:t>
+              <w:t>159.229 € / 73.490 € / 4.705.908 €</w:t>
             </w:r>
           </w:p>
         </w:tc>
@@ -3174,7 +3174,7 @@
                 <w:b w:val="0"/>
                 <w:sz w:val="17"/>
               </w:rPr>
-              <w:t>137.228 € / 110.170 € / 4.096.355 €</w:t>
+              <w:t>140.715 € / 112.849 € / 4.180.825 €</w:t>
             </w:r>
           </w:p>
         </w:tc>
@@ -3192,7 +3192,7 @@
                 <w:b w:val="0"/>
                 <w:sz w:val="17"/>
               </w:rPr>
-              <w:t>129.604 € / 104.299 € / 3.908.950 €</w:t>
+              <w:t>133.019 € / 106.923 € / 3.991.636 €</w:t>
             </w:r>
           </w:p>
         </w:tc>
@@ -3210,7 +3210,7 @@
                 <w:b w:val="0"/>
                 <w:sz w:val="17"/>
               </w:rPr>
-              <w:t>124.378 € / 100.002 € / 3.738.479 €</w:t>
+              <w:t>129.248 € / 103.471 € / 3.814.894 €</w:t>
             </w:r>
           </w:p>
         </w:tc>
@@ -3245,7 +3245,7 @@
                 <w:b w:val="0"/>
                 <w:sz w:val="17"/>
               </w:rPr>
-              <w:t>62.676 € / 184.722 € / 1.896.976 €</w:t>
+              <w:t>63.935 € / 189.630 € / 1.925.097 €</w:t>
             </w:r>
           </w:p>
         </w:tc>
@@ -3263,7 +3263,7 @@
                 <w:b w:val="0"/>
                 <w:sz w:val="17"/>
               </w:rPr>
-              <w:t>59.868 € / 174.036 € / 1.832.590 €</w:t>
+              <w:t>61.100 € / 178.841 € / 1.860.098 €</w:t>
             </w:r>
           </w:p>
         </w:tc>
@@ -3281,7 +3281,7 @@
                 <w:b w:val="0"/>
                 <w:sz w:val="17"/>
               </w:rPr>
-              <w:t>57.275 € / 167.105 € / 1.746.003 €</w:t>
+              <w:t>58.376 € / 174.343 € / 1.743.338 €</w:t>
             </w:r>
           </w:p>
         </w:tc>
@@ -3403,7 +3403,7 @@
                 <w:b w:val="0"/>
                 <w:sz w:val="17"/>
               </w:rPr>
-              <w:t>142.854 €</w:t>
+              <w:t>147.335 €</w:t>
             </w:r>
           </w:p>
         </w:tc>
@@ -3421,7 +3421,7 @@
                 <w:b w:val="0"/>
                 <w:sz w:val="17"/>
               </w:rPr>
-              <w:t>126.379 €</w:t>
+              <w:t>130.685 €</w:t>
             </w:r>
           </w:p>
         </w:tc>
@@ -3439,7 +3439,7 @@
                 <w:b w:val="0"/>
                 <w:sz w:val="17"/>
               </w:rPr>
-              <w:t>112.037 €</w:t>
+              <w:t>116.169 €</w:t>
             </w:r>
           </w:p>
         </w:tc>
@@ -3545,7 +3545,7 @@
                 <w:b w:val="0"/>
                 <w:sz w:val="17"/>
               </w:rPr>
-              <w:t>45.120 €</w:t>
+              <w:t>44.640 €</w:t>
             </w:r>
           </w:p>
         </w:tc>
@@ -3563,7 +3563,7 @@
                 <w:b w:val="0"/>
                 <w:sz w:val="17"/>
               </w:rPr>
-              <w:t>45.120 €</w:t>
+              <w:t>44.640 €</w:t>
             </w:r>
           </w:p>
         </w:tc>
@@ -3581,7 +3581,7 @@
                 <w:b w:val="0"/>
                 <w:sz w:val="17"/>
               </w:rPr>
-              <w:t>45.120 €</w:t>
+              <w:t>44.640 €</w:t>
             </w:r>
           </w:p>
         </w:tc>
@@ -3616,7 +3616,7 @@
                 <w:b w:val="0"/>
                 <w:sz w:val="17"/>
               </w:rPr>
-              <w:t>−19.456 €</w:t>
+              <w:t>−19.856 €</w:t>
             </w:r>
           </w:p>
         </w:tc>
@@ -3634,7 +3634,7 @@
                 <w:b w:val="0"/>
                 <w:sz w:val="17"/>
               </w:rPr>
-              <w:t>−17.809 €</w:t>
+              <w:t>−18.191 €</w:t>
             </w:r>
           </w:p>
         </w:tc>
@@ -3652,7 +3652,7 @@
                 <w:b w:val="0"/>
                 <w:sz w:val="17"/>
               </w:rPr>
-              <w:t>−16.374 €</w:t>
+              <w:t>−16.740 €</w:t>
             </w:r>
           </w:p>
         </w:tc>
@@ -3687,7 +3687,7 @@
                 <w:b w:val="0"/>
                 <w:sz w:val="17"/>
               </w:rPr>
-              <w:t>78.857 €</w:t>
+              <w:t>79.337 €</w:t>
             </w:r>
           </w:p>
         </w:tc>
@@ -3705,7 +3705,7 @@
                 <w:b w:val="0"/>
                 <w:sz w:val="17"/>
               </w:rPr>
-              <w:t>78.857 €</w:t>
+              <w:t>79.337 €</w:t>
             </w:r>
           </w:p>
         </w:tc>
@@ -3723,7 +3723,7 @@
                 <w:b w:val="0"/>
                 <w:sz w:val="17"/>
               </w:rPr>
-              <w:t>78.857 €</w:t>
+              <w:t>79.337 €</w:t>
             </w:r>
           </w:p>
         </w:tc>
@@ -3758,7 +3758,7 @@
                 <w:b/>
                 <w:sz w:val="17"/>
               </w:rPr>
-              <w:t>253.962 €</w:t>
+              <w:t>258.043 €</w:t>
             </w:r>
           </w:p>
         </w:tc>
@@ -3776,7 +3776,7 @@
                 <w:b/>
                 <w:sz w:val="17"/>
               </w:rPr>
-              <w:t>239.135 €</w:t>
+              <w:t>243.059 €</w:t>
             </w:r>
           </w:p>
         </w:tc>
@@ -3794,7 +3794,7 @@
                 <w:b/>
                 <w:sz w:val="17"/>
               </w:rPr>
-              <w:t>226.227 €</w:t>
+              <w:t>229.994 €</w:t>
             </w:r>
           </w:p>
         </w:tc>
@@ -3829,7 +3829,7 @@
                 <w:b w:val="0"/>
                 <w:sz w:val="17"/>
               </w:rPr>
-              <w:t>−247.398 €</w:t>
+              <w:t>−253.565 €</w:t>
             </w:r>
           </w:p>
         </w:tc>
@@ -3847,7 +3847,7 @@
                 <w:b w:val="0"/>
                 <w:sz w:val="17"/>
               </w:rPr>
-              <w:t>−233.903 €</w:t>
+              <w:t>−239.941 €</w:t>
             </w:r>
           </w:p>
         </w:tc>
@@ -3865,7 +3865,7 @@
                 <w:b w:val="0"/>
                 <w:sz w:val="17"/>
               </w:rPr>
-              <w:t>−224.380 €</w:t>
+              <w:t>−232.719 €</w:t>
             </w:r>
           </w:p>
         </w:tc>
@@ -3900,7 +3900,7 @@
                 <w:b/>
                 <w:sz w:val="17"/>
               </w:rPr>
-              <w:t>+6.564 €</w:t>
+              <w:t>+4.478 €</w:t>
             </w:r>
           </w:p>
         </w:tc>
@@ -3918,7 +3918,7 @@
                 <w:b/>
                 <w:sz w:val="17"/>
               </w:rPr>
-              <w:t>+5.231 €</w:t>
+              <w:t>+3.117 €</w:t>
             </w:r>
           </w:p>
         </w:tc>
@@ -3936,7 +3936,7 @@
                 <w:b/>
                 <w:sz w:val="17"/>
               </w:rPr>
-              <w:t>+1.847 €</w:t>
+              <w:t>−2.725 €</w:t>
             </w:r>
           </w:p>
         </w:tc>
@@ -4058,7 +4058,7 @@
                 <w:b w:val="0"/>
                 <w:sz w:val="17"/>
               </w:rPr>
-              <w:t>3.586.100 €</w:t>
+              <w:t>3.669.854 €</w:t>
             </w:r>
           </w:p>
         </w:tc>
@@ -4076,7 +4076,7 @@
                 <w:b w:val="0"/>
                 <w:sz w:val="17"/>
               </w:rPr>
-              <w:t>3.254.865 €</w:t>
+              <w:t>3.335.133 €</w:t>
             </w:r>
           </w:p>
         </w:tc>
@@ -4094,7 +4094,7 @@
                 <w:b w:val="0"/>
                 <w:sz w:val="17"/>
               </w:rPr>
-              <w:t>2.966.450 €</w:t>
+              <w:t>3.043.233 €</w:t>
             </w:r>
           </w:p>
         </w:tc>
@@ -4129,7 +4129,7 @@
                 <w:b w:val="0"/>
                 <w:sz w:val="17"/>
               </w:rPr>
-              <w:t>3.227.490 €</w:t>
+              <w:t>3.302.869 €</w:t>
             </w:r>
           </w:p>
         </w:tc>
@@ -4147,7 +4147,7 @@
                 <w:b w:val="0"/>
                 <w:sz w:val="17"/>
               </w:rPr>
-              <w:t>2.929.379 €</w:t>
+              <w:t>3.001.620 €</w:t>
             </w:r>
           </w:p>
         </w:tc>
@@ -4165,7 +4165,7 @@
                 <w:b w:val="0"/>
                 <w:sz w:val="17"/>
               </w:rPr>
-              <w:t>2.669.805 €</w:t>
+              <w:t>2.738.910 €</w:t>
             </w:r>
           </w:p>
         </w:tc>
@@ -4236,7 +4236,7 @@
                 <w:b w:val="0"/>
                 <w:sz w:val="17"/>
               </w:rPr>
-              <w:t>196 %</w:t>
+              <w:t>195 %</w:t>
             </w:r>
           </w:p>
         </w:tc>
@@ -4271,7 +4271,7 @@
                 <w:b w:val="0"/>
                 <w:sz w:val="17"/>
               </w:rPr>
-              <w:t>3.142.956 €</w:t>
+              <w:t>3.204.620 €</w:t>
             </w:r>
           </w:p>
         </w:tc>
@@ -4289,7 +4289,7 @@
                 <w:b w:val="0"/>
                 <w:sz w:val="17"/>
               </w:rPr>
-              <w:t>3.111.547 €</w:t>
+              <w:t>3.173.151 €</w:t>
             </w:r>
           </w:p>
         </w:tc>
@@ -4307,7 +4307,7 @@
                 <w:b w:val="0"/>
                 <w:sz w:val="17"/>
               </w:rPr>
-              <w:t>3.083.742 €</w:t>
+              <w:t>3.148.869 €</w:t>
             </w:r>
           </w:p>
         </w:tc>
@@ -4338,7 +4338,7 @@
         <w:rPr>
           <w:b w:val="0"/>
         </w:rPr>
-        <w:t>Ergebnis pro Monat nach Kapitaldienst (Plan) und Stresstests: siehe Präsentation, Folie 'Prognose und Belastungstest'. Ohne Gastro fällt das Ergebnis auf −9.408 € / −9.520 € / −9.802 € pro Monat.</w:t>
+        <w:t>Ergebnis pro Monat nach Kapitaldienst (Plan) und Stresstests: siehe Präsentation, Folie 'Prognose und Belastungstest'. Ohne Gastro fällt das Ergebnis auf −9.586 € / −9.700 € / −10.187 € pro Monat.</w:t>
       </w:r>
     </w:p>
     <w:p>

</xml_diff>